<commit_message>
site: sync 2026-10-23 00:29
</commit_message>
<xml_diff>
--- a/documents/files/readme.docx
+++ b/documents/files/readme.docx
@@ -23,7 +23,7 @@
         <w:pStyle w:val="Date"/>
       </w:pPr>
       <w:r>
-        <w:t xml:space="preserve">2026-10-20</w:t>
+        <w:t xml:space="preserve">2026-10-23</w:t>
       </w:r>
     </w:p>
     <w:p>
@@ -465,12 +465,12 @@
         <w:tblLook w:firstRow="1" w:lastRow="0" w:firstColumn="0" w:lastColumn="0" w:noHBand="0" w:noVBand="0" w:val="0020"/>
       </w:tblPr>
       <w:tblGrid>
-        <w:gridCol w:w="2199"/>
-        <w:gridCol w:w="2913"/>
-        <w:gridCol w:w="1013"/>
-        <w:gridCol w:w="1013"/>
-        <w:gridCol w:w="1013"/>
-        <w:gridCol w:w="1487"/>
+        <w:gridCol w:w="2254"/>
+        <w:gridCol w:w="2988"/>
+        <w:gridCol w:w="1038"/>
+        <w:gridCol w:w="1038"/>
+        <w:gridCol w:w="1038"/>
+        <w:gridCol w:w="1282"/>
       </w:tblGrid>
       <w:tr>
         <w:trPr>
@@ -478,7 +478,7 @@
         </w:trPr>
         <w:tc>
           <w:tcPr>
-            <w:tcW w:w="2199" w:type="dxa"/>
+            <w:tcW w:w="2254" w:type="dxa"/>
           </w:tcPr>
           <w:p>
             <w:pPr>
@@ -492,7 +492,7 @@
         </w:tc>
         <w:tc>
           <w:tcPr>
-            <w:tcW w:w="2913" w:type="dxa"/>
+            <w:tcW w:w="2988" w:type="dxa"/>
           </w:tcPr>
           <w:p>
             <w:pPr>
@@ -506,7 +506,7 @@
         </w:tc>
         <w:tc>
           <w:tcPr>
-            <w:tcW w:w="1013" w:type="dxa"/>
+            <w:tcW w:w="1038" w:type="dxa"/>
           </w:tcPr>
           <w:p>
             <w:pPr>
@@ -520,7 +520,7 @@
         </w:tc>
         <w:tc>
           <w:tcPr>
-            <w:tcW w:w="1013" w:type="dxa"/>
+            <w:tcW w:w="1038" w:type="dxa"/>
           </w:tcPr>
           <w:p>
             <w:pPr>
@@ -534,7 +534,7 @@
         </w:tc>
         <w:tc>
           <w:tcPr>
-            <w:tcW w:w="1013" w:type="dxa"/>
+            <w:tcW w:w="1038" w:type="dxa"/>
           </w:tcPr>
           <w:p>
             <w:pPr>
@@ -548,7 +548,7 @@
         </w:tc>
         <w:tc>
           <w:tcPr>
-            <w:tcW w:w="1487" w:type="dxa"/>
+            <w:tcW w:w="1282" w:type="dxa"/>
           </w:tcPr>
           <w:p>
             <w:pPr>
@@ -564,7 +564,7 @@
       <w:tr>
         <w:tc>
           <w:tcPr>
-            <w:tcW w:w="2199" w:type="dxa"/>
+            <w:tcW w:w="2254" w:type="dxa"/>
           </w:tcPr>
           <w:p>
             <w:pPr>
@@ -581,7 +581,7 @@
         </w:tc>
         <w:tc>
           <w:tcPr>
-            <w:tcW w:w="2913" w:type="dxa"/>
+            <w:tcW w:w="2988" w:type="dxa"/>
           </w:tcPr>
           <w:p>
             <w:pPr>
@@ -595,7 +595,7 @@
         </w:tc>
         <w:tc>
           <w:tcPr>
-            <w:tcW w:w="1013" w:type="dxa"/>
+            <w:tcW w:w="1038" w:type="dxa"/>
           </w:tcPr>
           <w:p>
             <w:pPr>
@@ -609,7 +609,7 @@
         </w:tc>
         <w:tc>
           <w:tcPr>
-            <w:tcW w:w="1013" w:type="dxa"/>
+            <w:tcW w:w="1038" w:type="dxa"/>
           </w:tcPr>
           <w:p>
             <w:pPr>
@@ -623,7 +623,7 @@
         </w:tc>
         <w:tc>
           <w:tcPr>
-            <w:tcW w:w="1013" w:type="dxa"/>
+            <w:tcW w:w="1038" w:type="dxa"/>
           </w:tcPr>
           <w:p>
             <w:pPr>
@@ -637,7 +637,7 @@
         </w:tc>
         <w:tc>
           <w:tcPr>
-            <w:tcW w:w="1487" w:type="dxa"/>
+            <w:tcW w:w="1282" w:type="dxa"/>
           </w:tcPr>
           <w:p>
             <w:pPr>
@@ -653,7 +653,7 @@
       <w:tr>
         <w:tc>
           <w:tcPr>
-            <w:tcW w:w="2199" w:type="dxa"/>
+            <w:tcW w:w="2254" w:type="dxa"/>
           </w:tcPr>
           <w:p>
             <w:pPr>
@@ -670,7 +670,7 @@
         </w:tc>
         <w:tc>
           <w:tcPr>
-            <w:tcW w:w="2913" w:type="dxa"/>
+            <w:tcW w:w="2988" w:type="dxa"/>
           </w:tcPr>
           <w:p>
             <w:pPr>
@@ -684,7 +684,7 @@
         </w:tc>
         <w:tc>
           <w:tcPr>
-            <w:tcW w:w="1013" w:type="dxa"/>
+            <w:tcW w:w="1038" w:type="dxa"/>
           </w:tcPr>
           <w:p>
             <w:pPr>
@@ -698,7 +698,7 @@
         </w:tc>
         <w:tc>
           <w:tcPr>
-            <w:tcW w:w="1013" w:type="dxa"/>
+            <w:tcW w:w="1038" w:type="dxa"/>
           </w:tcPr>
           <w:p>
             <w:pPr>
@@ -712,7 +712,7 @@
         </w:tc>
         <w:tc>
           <w:tcPr>
-            <w:tcW w:w="1013" w:type="dxa"/>
+            <w:tcW w:w="1038" w:type="dxa"/>
           </w:tcPr>
           <w:p>
             <w:pPr>
@@ -726,7 +726,7 @@
         </w:tc>
         <w:tc>
           <w:tcPr>
-            <w:tcW w:w="1487" w:type="dxa"/>
+            <w:tcW w:w="1282" w:type="dxa"/>
           </w:tcPr>
           <w:p>
             <w:pPr>
@@ -742,7 +742,7 @@
       <w:tr>
         <w:tc>
           <w:tcPr>
-            <w:tcW w:w="2199" w:type="dxa"/>
+            <w:tcW w:w="2254" w:type="dxa"/>
           </w:tcPr>
           <w:p>
             <w:pPr>
@@ -759,7 +759,7 @@
         </w:tc>
         <w:tc>
           <w:tcPr>
-            <w:tcW w:w="2913" w:type="dxa"/>
+            <w:tcW w:w="2988" w:type="dxa"/>
           </w:tcPr>
           <w:p>
             <w:pPr>
@@ -773,7 +773,7 @@
         </w:tc>
         <w:tc>
           <w:tcPr>
-            <w:tcW w:w="1013" w:type="dxa"/>
+            <w:tcW w:w="1038" w:type="dxa"/>
           </w:tcPr>
           <w:p>
             <w:pPr>
@@ -787,7 +787,7 @@
         </w:tc>
         <w:tc>
           <w:tcPr>
-            <w:tcW w:w="1013" w:type="dxa"/>
+            <w:tcW w:w="1038" w:type="dxa"/>
           </w:tcPr>
           <w:p>
             <w:pPr>
@@ -801,7 +801,7 @@
         </w:tc>
         <w:tc>
           <w:tcPr>
-            <w:tcW w:w="1013" w:type="dxa"/>
+            <w:tcW w:w="1038" w:type="dxa"/>
           </w:tcPr>
           <w:p>
             <w:pPr>
@@ -815,7 +815,7 @@
         </w:tc>
         <w:tc>
           <w:tcPr>
-            <w:tcW w:w="1487" w:type="dxa"/>
+            <w:tcW w:w="1282" w:type="dxa"/>
           </w:tcPr>
           <w:p>
             <w:pPr>
@@ -831,7 +831,7 @@
       <w:tr>
         <w:tc>
           <w:tcPr>
-            <w:tcW w:w="2199" w:type="dxa"/>
+            <w:tcW w:w="2254" w:type="dxa"/>
           </w:tcPr>
           <w:p>
             <w:pPr>
@@ -841,6 +841,8 @@
             <w:r>
               <w:rPr>
                 <w:rStyle w:val="VerbatimChar"/>
+                <w:b/>
+                <w:bCs/>
               </w:rPr>
               <w:t xml:space="preserve">a3_b10_p200k_e60</w:t>
             </w:r>
@@ -848,7 +850,7 @@
         </w:tc>
         <w:tc>
           <w:tcPr>
-            <w:tcW w:w="2913" w:type="dxa"/>
+            <w:tcW w:w="2988" w:type="dxa"/>
           </w:tcPr>
           <w:p>
             <w:pPr>
@@ -862,57 +864,69 @@
         </w:tc>
         <w:tc>
           <w:tcPr>
-            <w:tcW w:w="1013" w:type="dxa"/>
-          </w:tcPr>
-          <w:p>
-            <w:pPr>
-              <w:pStyle w:val="Compact"/>
-              <w:jc w:val="left"/>
-            </w:pPr>
-            <w:r>
-              <w:t xml:space="preserve">进行中</w:t>
-            </w:r>
-          </w:p>
-        </w:tc>
-        <w:tc>
-          <w:tcPr>
-            <w:tcW w:w="1013" w:type="dxa"/>
-          </w:tcPr>
-          <w:p>
-            <w:pPr>
-              <w:pStyle w:val="Compact"/>
-              <w:jc w:val="left"/>
-            </w:pPr>
-            <w:r>
-              <w:t xml:space="preserve">—</w:t>
-            </w:r>
-          </w:p>
-        </w:tc>
-        <w:tc>
-          <w:tcPr>
-            <w:tcW w:w="1013" w:type="dxa"/>
-          </w:tcPr>
-          <w:p>
-            <w:pPr>
-              <w:pStyle w:val="Compact"/>
-              <w:jc w:val="left"/>
-            </w:pPr>
-            <w:r>
-              <w:t xml:space="preserve">—</w:t>
-            </w:r>
-          </w:p>
-        </w:tc>
-        <w:tc>
-          <w:tcPr>
-            <w:tcW w:w="1487" w:type="dxa"/>
-          </w:tcPr>
-          <w:p>
-            <w:pPr>
-              <w:pStyle w:val="Compact"/>
-              <w:jc w:val="left"/>
-            </w:pPr>
-            <w:r>
-              <w:t xml:space="preserve">预计 ~10 h</w:t>
+            <w:tcW w:w="1038" w:type="dxa"/>
+          </w:tcPr>
+          <w:p>
+            <w:pPr>
+              <w:pStyle w:val="Compact"/>
+              <w:jc w:val="left"/>
+            </w:pPr>
+            <w:r>
+              <w:rPr>
+                <w:b/>
+                <w:bCs/>
+              </w:rPr>
+              <w:t xml:space="preserve">0.7815</w:t>
+            </w:r>
+          </w:p>
+        </w:tc>
+        <w:tc>
+          <w:tcPr>
+            <w:tcW w:w="1038" w:type="dxa"/>
+          </w:tcPr>
+          <w:p>
+            <w:pPr>
+              <w:pStyle w:val="Compact"/>
+              <w:jc w:val="left"/>
+            </w:pPr>
+            <w:r>
+              <w:rPr>
+                <w:b/>
+                <w:bCs/>
+              </w:rPr>
+              <w:t xml:space="preserve">0.7931</w:t>
+            </w:r>
+          </w:p>
+        </w:tc>
+        <w:tc>
+          <w:tcPr>
+            <w:tcW w:w="1038" w:type="dxa"/>
+          </w:tcPr>
+          <w:p>
+            <w:pPr>
+              <w:pStyle w:val="Compact"/>
+              <w:jc w:val="left"/>
+            </w:pPr>
+            <w:r>
+              <w:rPr>
+                <w:b/>
+                <w:bCs/>
+              </w:rPr>
+              <w:t xml:space="preserve">0.8241</w:t>
+            </w:r>
+          </w:p>
+        </w:tc>
+        <w:tc>
+          <w:tcPr>
+            <w:tcW w:w="1282" w:type="dxa"/>
+          </w:tcPr>
+          <w:p>
+            <w:pPr>
+              <w:pStyle w:val="Compact"/>
+              <w:jc w:val="left"/>
+            </w:pPr>
+            <w:r>
+              <w:t xml:space="preserve">425 min</w:t>
             </w:r>
           </w:p>
         </w:tc>
@@ -933,7 +947,17 @@
         <w:t xml:space="preserve">加深度优于加数据</w:t>
       </w:r>
       <w:r>
-        <w:t xml:space="preserve">（5→10 blk +0.041 @L=9，数据 ×5 仅 +0.021 @L=25）。</w:t>
+        <w:t xml:space="preserve">（5→10 blk +0.041 @L=9，数据 ×5 仅 +0.021 @L=25）。P2 后已</w:t>
+      </w:r>
+      <w:r>
+        <w:rPr>
+          <w:b/>
+          <w:bCs/>
+        </w:rPr>
+        <w:t xml:space="preserve">饱和</w:t>
+      </w:r>
+      <w:r>
+        <w:t xml:space="preserve">：ep51 第二次降 LR 仅 +0.0002，ep55 达峰，继续加 epoch 无收益。</w:t>
       </w:r>
     </w:p>
     <w:p>
@@ -1326,7 +1350,41 @@
         <w:t xml:space="preserve">.mat</w:t>
       </w:r>
       <w:r>
-        <w:t xml:space="preserve">）尚未入库，当前全部结论基于合成数据。</w:t>
+        <w:t xml:space="preserve">）尚未入库，当前全部结论基于合成数据。真实数据到位后先过</w:t>
+      </w:r>
+      <w:r>
+        <w:t xml:space="preserve"> </w:t>
+      </w:r>
+      <w:r>
+        <w:rPr>
+          <w:b/>
+          <w:bCs/>
+        </w:rPr>
+        <w:t xml:space="preserve">数据门禁</w:t>
+      </w:r>
+      <w:r>
+        <w:t xml:space="preserve">（</w:t>
+      </w:r>
+      <w:r>
+        <w:rPr>
+          <w:rStyle w:val="VerbatimChar"/>
+        </w:rPr>
+        <w:t xml:space="preserve">daninet/edge/audit.py</w:t>
+      </w:r>
+      <w:r>
+        <w:t xml:space="preserve">，规范见</w:t>
+      </w:r>
+      <w:r>
+        <w:t xml:space="preserve"> </w:t>
+      </w:r>
+      <w:r>
+        <w:rPr>
+          <w:rStyle w:val="VerbatimChar"/>
+        </w:rPr>
+        <w:t xml:space="preserve">specs/SPEC-003</w:t>
+      </w:r>
+      <w:r>
+        <w:t xml:space="preserve">）再谈训练——合成集的块边界仅部分可辨识，不能把合成指标当真实性能。</w:t>
       </w:r>
     </w:p>
     <w:p>

</xml_diff>